<commit_message>
fix: remove KETNOI NKN MODEL award per user confirmation; set strictly to 7 verified 2569 awards
</commit_message>
<xml_diff>
--- a/assets/docs/รายงานผลการพัฒนางาน PA 2569 นายอนันตชัย เพ็ชรรี่.docx
+++ b/assets/docs/รายงานผลการพัฒนางาน PA 2569 นายอนันตชัย เพ็ชรรี่.docx
@@ -265,7 +265,7 @@
           <w:rFonts w:ascii="TH Sarabun New" w:hAnsi="TH Sarabun New" w:eastAsia="TH Sarabun New"/>
           <w:b w:val="0"/>
         </w:rPr>
-        <w:t>นอกจากนี้ ได้สรุปผลการปฏิบัติงานตามมาตรฐานตำแหน่ง ๓ ด้าน ๑๕ ตัวชี้วัด และรายงานผลการพัฒนางานที่เป็นประเด็นท้าทาย เรื่อง "การพัฒนาทักษะการใช้เมาส์ ๔ ด้าน ของนักเรียนชั้นประถมศึกษาปีที่ ๑ โดยใช้การจัดการเรียนรู้แบบ Active Learning ร่วมกับสื่อเกมการศึกษา (Gamification) บนระบบ Kru James Soncom" ซึ่งมีผลลัพธ์เชิงประจักษ์ว่านักเรียนชั้น ป.๑ ทั้ง ๑๑ คน (๑๐๐%) ผ่านเกณฑ์การประเมินระดับดีขึ้นไป พร้อมทั้งรวบรวมรางวัลและผลงานแห่งความภาคภูมิใจในรอบปีงบประมาณ ๒๕๖๙ จำนวน ๘ รายการ ข้าพเจ้าหวังเป็นอย่างยิ่งว่ารายงานฉบับนี้จะเป็นประโยชน์ต่อการประเมินผลการปฏิบัติงานต่อไป</w:t>
+        <w:t>นอกจากนี้ ได้สรุปผลการปฏิบัติงานตามมาตรฐานตำแหน่ง ๓ ด้าน ๑๕ ตัวชี้วัด และรายงานผลการพัฒนางานที่เป็นประเด็นท้าทาย เรื่อง "การพัฒนาทักษะการใช้เมาส์ ๔ ด้าน ของนักเรียนชั้นประถมศึกษาปีที่ ๑ โดยใช้การจัดการเรียนรู้แบบ Active Learning ร่วมกับสื่อเกมการศึกษา (Gamification) บนระบบ Kru James Soncom" ซึ่งมีผลลัพธ์เชิงประจักษ์ว่านักเรียนชั้น ป.๑ ทั้ง ๑๑ คน (๑๐๐%) ผ่านเกณฑ์การประเมินระดับดีขึ้นไป พร้อมทั้งรวบรวมรางวัลและผลงานแห่งความภาคภูมิใจในรอบปีงบประมาณ ๒๕๖๙ จำนวน ๗ รายการ ข้าพเจ้าหวังเป็นอย่างยิ่งว่ารายงานฉบับนี้จะเป็นประโยชน์ต่อการประเมินผลการปฏิบัติงานต่อไป</w:t>
       </w:r>
     </w:p>
     <w:p>
@@ -758,7 +758,7 @@
               <w:rPr>
                 <w:sz w:val="26"/>
               </w:rPr>
-              <w:t>ตารางสรุปผลงานและรางวัลรอบปีงบประมาณ ๒๕๖๙ (๘ รายการจริง)</w:t>
+              <w:t>ตารางสรุปผลงานและรางวัลรอบปีงบประมาณ ๒๕๖๙ (๗ รายการจริง)</w:t>
             </w:r>
           </w:p>
         </w:tc>
@@ -4832,7 +4832,7 @@
               <w:rPr>
                 <w:sz w:val="26"/>
               </w:rPr>
-              <w:t>สร้างนวัตกรรมเกมมิฟิเคชัน ๑ ระบบ, ผลิตสื่อดิจิทัล ๖๒ ชิ้น, ฝึกสอนนักเรียนคว้า ๘ รางวัลสำคัญในปี ๒๕๖๙</w:t>
+              <w:t>สร้างนวัตกรรมเกมมิฟิเคชัน ๑ ระบบ, ผลิตสื่อดิจิทัล ๖๒ ชิ้น, ฝึกสอนนักเรียนคว้า ๗ รางวัลสำคัญในปี ๒๕๖๙</w:t>
             </w:r>
           </w:p>
         </w:tc>
@@ -4866,7 +4866,7 @@
               <w:rPr>
                 <w:sz w:val="26"/>
               </w:rPr>
-              <w:t>รายงานประเด็นท้าทาย, โล่และเกียรติบัตรรางวัล ๘ รายการ, ผลงานนักเรียนที่ได้รับรางวัล, เว็บไซต์ E-Portfolio</w:t>
+              <w:t>รายงานประเด็นท้าทาย, โล่และเกียรติบัตรรางวัล ๗ รายการ, ผลงานนักเรียนที่ได้รับรางวัล, เว็บไซต์ E-Portfolio</w:t>
             </w:r>
           </w:p>
         </w:tc>
@@ -7993,7 +7993,7 @@
           <w:color w:val="8F1D2C"/>
           <w:sz w:val="40"/>
         </w:rPr>
-        <w:t>ตารางสรุปผลงานและรางวัลรอบปีงบประมาณ ๒๕๖๙ (๘ รายการจริง)</w:t>
+        <w:t>ตารางสรุปผลงานและรางวัลรอบปีงบประมาณ ๒๕๖๙ (๗ รายการจริง)</w:t>
       </w:r>
     </w:p>
     <w:p>
@@ -8740,98 +8740,6 @@
                 <w:sz w:val="26"/>
               </w:rPr>
               <w:t>๒๖ มิถุนายน ๒๕๖๙</w:t>
-            </w:r>
-          </w:p>
-        </w:tc>
-      </w:tr>
-      <w:tr>
-        <w:tc>
-          <w:tcPr>
-            <w:tcW w:type="dxa" w:w="720"/>
-            <w:vAlign w:val="center"/>
-            <w:shd w:fill="F8EEF0"/>
-          </w:tcPr>
-          <w:p>
-            <w:pPr>
-              <w:spacing w:after="40" w:before="40"/>
-            </w:pPr>
-            <w:r>
-              <w:rPr>
-                <w:sz w:val="26"/>
-              </w:rPr>
-              <w:t>๘</w:t>
-            </w:r>
-          </w:p>
-        </w:tc>
-        <w:tc>
-          <w:tcPr>
-            <w:tcW w:type="dxa" w:w="3888"/>
-            <w:vAlign w:val="center"/>
-            <w:shd w:fill="F8EEF0"/>
-          </w:tcPr>
-          <w:p>
-            <w:pPr>
-              <w:spacing w:after="40" w:before="40"/>
-            </w:pPr>
-            <w:r>
-              <w:rPr>
-                <w:sz w:val="26"/>
-              </w:rPr>
-              <w:t>การจัดแสดงนิทรรศการโรงเรียนสุจริต รูปแบบ KETNOI NKN MODEL แลกเปลี่ยนเรียนรู้ระดับเขตพื้นที่</w:t>
-            </w:r>
-          </w:p>
-        </w:tc>
-        <w:tc>
-          <w:tcPr>
-            <w:tcW w:type="dxa" w:w="2160"/>
-            <w:vAlign w:val="center"/>
-            <w:shd w:fill="F8EEF0"/>
-          </w:tcPr>
-          <w:p>
-            <w:pPr>
-              <w:spacing w:after="40" w:before="40"/>
-            </w:pPr>
-            <w:r>
-              <w:rPr>
-                <w:sz w:val="26"/>
-              </w:rPr>
-              <w:t>เกียรติบัตรจัดนิทรรศการยอดเยี่ยม</w:t>
-            </w:r>
-          </w:p>
-        </w:tc>
-        <w:tc>
-          <w:tcPr>
-            <w:tcW w:type="dxa" w:w="2160"/>
-            <w:vAlign w:val="center"/>
-            <w:shd w:fill="F8EEF0"/>
-          </w:tcPr>
-          <w:p>
-            <w:pPr>
-              <w:spacing w:after="40" w:before="40"/>
-            </w:pPr>
-            <w:r>
-              <w:rPr>
-                <w:sz w:val="26"/>
-              </w:rPr>
-              <w:t>สำนักงานเขตพื้นที่การศึกษาประถมศึกษากำแพงเพชร เขต ๒</w:t>
-            </w:r>
-          </w:p>
-        </w:tc>
-        <w:tc>
-          <w:tcPr>
-            <w:tcW w:type="dxa" w:w="1728"/>
-            <w:vAlign w:val="center"/>
-            <w:shd w:fill="F8EEF0"/>
-          </w:tcPr>
-          <w:p>
-            <w:pPr>
-              <w:spacing w:after="40" w:before="40"/>
-            </w:pPr>
-            <w:r>
-              <w:rPr>
-                <w:sz w:val="26"/>
-              </w:rPr>
-              <w:t>๓๐ มีนาคม ๒๕๖๙</w:t>
             </w:r>
           </w:p>
         </w:tc>

</xml_diff>

<commit_message>
feat(academic): integrate Kru James Soncom admin portal as official academic reference system (curriculum, lesson plans, post-lesson logs, PP5 gradebook)
</commit_message>
<xml_diff>
--- a/assets/docs/รายงานผลการพัฒนางาน PA 2569 นายอนันตชัย เพ็ชรรี่.docx
+++ b/assets/docs/รายงานผลการพัฒนางาน PA 2569 นายอนันตชัย เพ็ชรรี่.docx
@@ -3282,7 +3282,7 @@
               <w:rPr>
                 <w:sz w:val="26"/>
               </w:rPr>
-              <w:t>วิเคราะห์หลักสูตรแกนกลางการศึกษาขั้นพื้นฐาน พ.ศ. ๒๕๕๑ (ฉบับปรับปรุง ๒๕๖๐) มาตรฐาน ว ๔.๒ และโครงสร้างหลักสูตรสถานศึกษา จัดทำหน่วยการเรียนรู้และคำอธิบายรายวิชาวิทยาการคำนวณ วิทยาศาสตร์ และการงานอาชีพ ให้สอดคล้องกับบริบทชุมชนและผู้เรียน</w:t>
+              <w:t>วิเคราะห์หลักสูตรแกนกลางการศึกษาขั้นพื้นฐาน พ.ศ. ๒๕๕๑ (ฉบับปรับปรุง ๒๕๖๐) มาตรฐาน ว ๔.๒ และโครงสร้างหลักสูตรสถานศึกษา จัดทำหน่วยการเรียนรู้และคำอธิบายรายวิชา และบริหารจัดการบนระบบวิชาการดิจิทัล Kru James Soncom (krujamesoncom-website.vercel.app/admin) โมดูล curriculum.ts</w:t>
             </w:r>
           </w:p>
         </w:tc>
@@ -3333,7 +3333,7 @@
               <w:rPr>
                 <w:sz w:val="26"/>
               </w:rPr>
-              <w:t>หลักสูตรสถานศึกษา, แผนผังโครงสร้างรายวิชา, คำอธิบายรายวิชา, เอกสารอนุมัติใช้หลักสูตร</w:t>
+              <w:t>หลักสูตรสถานศึกษา, แผนผังโครงสร้างรายวิชา, ระบบบริหารหลักสูตรออนไลน์ Kru James Soncom Admin</w:t>
             </w:r>
           </w:p>
         </w:tc>
@@ -3371,7 +3371,7 @@
               <w:rPr>
                 <w:sz w:val="26"/>
               </w:rPr>
-              <w:t>ออกแบบหน่วยการเรียนรู้เน้นผู้เรียนเป็นสำคัญตามแนวทาง Active Learning กำหนดจุดประสงค์การเรียนรู้ครบ K-P-A บูรณาการเกมมิฟิเคชัน (Gamification) และสถานการณ์จำลองเพื่อให้นักเรียนได้คิด วิเคราะห์ และลงมือแก้ปัญหา</w:t>
+              <w:t>ออกแบบหน่วยการเรียนรู้เน้นผู้เรียนเป็นสำคัญตามแนวทาง Active Learning กำหนดจุดประสงค์การเรียนรู้ครบ K-P-A บูรณาการเกมมิฟิเคชัน จัดทำแผนประเด็นท้าทาย ป.๑ (แผน ๕–๘ รวม ๒๐๐ นาที) และบริหารแผนบนระบบวิชาการออนไลน์ (krujamesoncom-website.vercel.app/admin)</w:t>
             </w:r>
           </w:p>
         </w:tc>
@@ -3425,7 +3425,7 @@
               <w:rPr>
                 <w:sz w:val="26"/>
               </w:rPr>
-              <w:t>แผนการจัดการเรียนรู้ Active Learning, บันทึกท้ายแผน, สื่อสไลด์ Canva, เครื่องมือประเมิน K-P-A</w:t>
+              <w:t>แผนการจัดการเรียนรู้ Active Learning, บันทึกท้ายแผน, ระบบบริหารแผนการสอนออนไลน์ Kru James Soncom Admin</w:t>
             </w:r>
           </w:p>
         </w:tc>
@@ -3461,7 +3461,7 @@
               <w:rPr>
                 <w:sz w:val="26"/>
               </w:rPr>
-              <w:t>จัดกิจกรรมการเรียนรู้เชิงรุก (Active Learning) ในห้องปฏิบัติการคอมพิวเตอร์ โดยครูทำหน้าที่ผู้อำนวยความสะดวก (Facilitator) และโค้ช ใช้การจัดการเรียนรู้โดยใช้เกมเป็นฐาน (Game-Based Learning) และกระบวนการเพื่อนช่วยเพื่อน (Peer Coaching)</w:t>
+              <w:t>จัดกิจกรรมการเรียนรู้เชิงรุก (Active Learning) ในห้องปฏิบัติการคอมพิวเตอร์ ครูทำหน้าที่ผู้อำนวยความสะดวกและโค้ช พร้อมบันทึกผลหลังสอน K-P-A รายชั่วโมง และเช็คชื่อเข้าเรียน Real-time ผ่านระบบวิชาการดิจิทัล (QuickAttendance &amp; LessonRecord)</w:t>
             </w:r>
           </w:p>
         </w:tc>
@@ -3512,7 +3512,7 @@
               <w:rPr>
                 <w:sz w:val="26"/>
               </w:rPr>
-              <w:t>ภาพถ่ายการสอนจริงในห้องคอมพิวเตอร์, บันทึกหลังสอน, ผลงานนักเรียน, บันทึกการนิเทศการสอน</w:t>
+              <w:t>ภาพถ่ายการสอนจริงห้องคอมฯ (๑๐ ก.ย. ๖๙), บันทึกหลังสอนดิจิทัล, ระบบบันทึกหลังแผนและเช็คชื่อออนไลน์</w:t>
             </w:r>
           </w:p>
         </w:tc>
@@ -3640,7 +3640,7 @@
               <w:rPr>
                 <w:sz w:val="26"/>
               </w:rPr>
-              <w:t>กำหนดเกณฑ์การวัดและประเมินผลที่หลากหลายตามสภาพจริง (Authentic Assessment) ประกอบด้วย แบบทดสอบก่อนเรียน-หลังเรียน (Pre-test/Post-test), รูบริกส์ประเมินทักษะปฏิบัติ ๓-๔ ระดับ, การสังเกตพฤติกรรม และการประเมินชิ้นงาน</w:t>
+              <w:t>กำหนดเกณฑ์การวัดและประเมินผลตามสภาพจริง มีแบบทดสอบ Pre/Post Test, รูบริกส์ประเมินทักษะเมาส์ ๔ ด้าน, สมุดคะแนนดิจิทัล GradeBook K/P/A และคลังข้อสอบ Interactive บนระบบ Kru James Soncom (krujamesoncom-website.vercel.app/admin)</w:t>
             </w:r>
           </w:p>
         </w:tc>
@@ -3691,7 +3691,7 @@
               <w:rPr>
                 <w:sz w:val="26"/>
               </w:rPr>
-              <w:t>แบบทดสอบ Pre/Post, รูบริกส์การประเมินทักษะ, ตารางบันทึกคะแนนเก็บ, รายงานสรุปคะแนน Quizizz</w:t>
+              <w:t>แบบทดสอบ Pre/Post, รูบริกส์ประเมินทักษะ, สมุดคะแนนดิจิทัล GradeBook, คลังข้อสอบ Interactive</w:t>
             </w:r>
           </w:p>
         </w:tc>
@@ -4135,7 +4135,7 @@
               <w:rPr>
                 <w:sz w:val="26"/>
               </w:rPr>
-              <w:t>จัดทำข้อมูลสารสนเทศประจำชั้น ม.๑ และข้อมูลผลการเรียนทุกรายวิชาในรูปแบบดิจิทัล (Google Sheets, ระบบทะเบียนวัดผล) บันทึกสถิติการมาเรียน คะแนนเก็บ คะแนนสอบ และติดตามความก้าวหน้าอย่างเป็นปัจจุบัน</w:t>
+              <w:t>จัดทำข้อมูลสารสนเทศประจำชั้น ม.๑ และข้อมูลผลการเรียนทุกรายวิชาในรูปแบบดิจิทัล พัฒนาระบบทะเบียนนักเรียน (Roster) และระบบส่งออกเอกสารทางการ ปพ.๕ ดิจิทัล ตามระเบียบ สพฐ. พิมพ์ PDF และส่งออก Excel/CSV ได้สมบูรณ์ ๑๐๐%</w:t>
             </w:r>
           </w:p>
         </w:tc>
@@ -4186,7 +4186,7 @@
               <w:rPr>
                 <w:sz w:val="26"/>
               </w:rPr>
-              <w:t>แฟ้มข้อมูลสารสนเทศ ปพ.๕, ทะเบียนรายชื่อนักเรียน ม.๑, สรุปสถิติการมาเรียน, ระบบคะแนนดิจิทัล</w:t>
+              <w:t>เอกสาร ปพ.๕ ดิจิทัล (PDF/Excel), ระบบ Roster ทะเบียน ม.๑, สถิติเวลาเรียน, ระบบบริหารวิชาการ Kru James Soncom</w:t>
             </w:r>
           </w:p>
         </w:tc>
@@ -5045,6 +5045,422 @@
       <w:r>
         <w:t>ขั้นที่ ๕ Evaluation (ประเมินผล): ทำการทดสอบหลังเรียน (Post-test) ประเมินทักษะปฏิบัติ ๔ ด้านตามเกณฑ์รูบริกส์ สังเกตพฤติกรรมการเรียนรู้ และนำผลการประเมินเข้าสู่กระบวนการแลกเปลี่ยนเรียนรู้ในกลุ่ม PLC Play and Learn</w:t>
       </w:r>
+    </w:p>
+    <w:p>
+      <w:pPr>
+        <w:spacing w:before="160" w:after="120"/>
+      </w:pPr>
+      <w:r>
+        <w:rPr>
+          <w:rFonts w:ascii="TH Sarabun New" w:hAnsi="TH Sarabun New" w:eastAsia="TH Sarabun New"/>
+          <w:b/>
+          <w:color w:val="8F1D2C"/>
+          <w:sz w:val="34"/>
+        </w:rPr>
+        <w:t>การเทียบเคียง ๔ เสาหลักระบบวิชาการดิจิทัล (Kru James Soncom Admin Portal)</w:t>
+      </w:r>
+    </w:p>
+    <w:p>
+      <w:pPr>
+        <w:spacing w:before="0" w:after="80"/>
+      </w:pPr>
+      <w:r>
+        <w:rPr>
+          <w:rFonts w:ascii="TH Sarabun New" w:hAnsi="TH Sarabun New" w:eastAsia="TH Sarabun New"/>
+          <w:b w:val="0"/>
+          <w:color w:val="1E3A8A"/>
+          <w:sz w:val="28"/>
+        </w:rPr>
+        <w:t>การดำเนินงานวิชาการและการจัดการเรียนรู้ทั้งหมด ได้รับการจัดเก็บและบริหารจัดการบนระบบสารสนเทศวิชาการ Kru James Soncom (https://krujamesoncom-website.vercel.app/admin) ซึ่งสามารถตรวจสอบร่องรอยหลักฐานเชิงประจักษ์ได้ ๔ ด้าน ดังนี้ :</w:t>
+      </w:r>
+    </w:p>
+    <w:tbl>
+      <w:tblPr>
+        <w:tblW w:type="auto" w:w="0"/>
+        <w:jc w:val="center"/>
+        <w:tblLayout w:type="fixed"/>
+        <w:tblLook w:firstColumn="1" w:firstRow="1" w:lastColumn="0" w:lastRow="0" w:noHBand="0" w:noVBand="1" w:val="04A0"/>
+        <w:tblBorders>
+          <w:top w:val="single" w:sz="4" w:color="D9D9D9"/>
+          <w:left w:val="single" w:sz="4" w:color="D9D9D9"/>
+          <w:bottom w:val="single" w:sz="4" w:color="D9D9D9"/>
+          <w:right w:val="single" w:sz="4" w:color="D9D9D9"/>
+          <w:insideH w:val="single" w:sz="4" w:color="D9D9D9"/>
+          <w:insideV w:val="single" w:sz="4" w:color="D9D9D9"/>
+        </w:tblBorders>
+      </w:tblPr>
+      <w:tblGrid>
+        <w:gridCol w:w="2469"/>
+        <w:gridCol w:w="2469"/>
+        <w:gridCol w:w="2469"/>
+        <w:gridCol w:w="2469"/>
+      </w:tblGrid>
+      <w:tr>
+        <w:trPr>
+          <w:tblHeader w:val="true"/>
+        </w:trPr>
+        <w:tc>
+          <w:tcPr>
+            <w:tcW w:type="dxa" w:w="2160"/>
+            <w:shd w:fill="8F1D2C"/>
+            <w:vAlign w:val="center"/>
+          </w:tcPr>
+          <w:p>
+            <w:r>
+              <w:rPr>
+                <w:b/>
+                <w:color w:val="FFFFFF"/>
+                <w:sz w:val="28"/>
+              </w:rPr>
+              <w:t>เสาหลักวิชาการ</w:t>
+            </w:r>
+          </w:p>
+        </w:tc>
+        <w:tc>
+          <w:tcPr>
+            <w:tcW w:type="dxa" w:w="2880"/>
+            <w:shd w:fill="8F1D2C"/>
+            <w:vAlign w:val="center"/>
+          </w:tcPr>
+          <w:p>
+            <w:r>
+              <w:rPr>
+                <w:b/>
+                <w:color w:val="FFFFFF"/>
+                <w:sz w:val="28"/>
+              </w:rPr>
+              <w:t>โมดูลบนระบบ (Kru James Soncom Admin)</w:t>
+            </w:r>
+          </w:p>
+        </w:tc>
+        <w:tc>
+          <w:tcPr>
+            <w:tcW w:type="dxa" w:w="3600"/>
+            <w:shd w:fill="8F1D2C"/>
+            <w:vAlign w:val="center"/>
+          </w:tcPr>
+          <w:p>
+            <w:r>
+              <w:rPr>
+                <w:b/>
+                <w:color w:val="FFFFFF"/>
+                <w:sz w:val="28"/>
+              </w:rPr>
+              <w:t>รายละเอียดและการนำไปใช้จริง</w:t>
+            </w:r>
+          </w:p>
+        </w:tc>
+        <w:tc>
+          <w:tcPr>
+            <w:tcW w:type="dxa" w:w="1440"/>
+            <w:shd w:fill="8F1D2C"/>
+            <w:vAlign w:val="center"/>
+          </w:tcPr>
+          <w:p>
+            <w:r>
+              <w:rPr>
+                <w:b/>
+                <w:color w:val="FFFFFF"/>
+                <w:sz w:val="28"/>
+              </w:rPr>
+              <w:t>เชื่อมโยงตัวชี้วัด PA</w:t>
+            </w:r>
+          </w:p>
+        </w:tc>
+      </w:tr>
+      <w:tr>
+        <w:tc>
+          <w:tcPr>
+            <w:tcW w:type="dxa" w:w="2160"/>
+            <w:vAlign w:val="center"/>
+          </w:tcPr>
+          <w:p>
+            <w:pPr>
+              <w:spacing w:after="40" w:before="40"/>
+            </w:pPr>
+            <w:r>
+              <w:rPr>
+                <w:sz w:val="26"/>
+              </w:rPr>
+              <w:t>๑. หลักสูตร (Curriculum)</w:t>
+            </w:r>
+          </w:p>
+        </w:tc>
+        <w:tc>
+          <w:tcPr>
+            <w:tcW w:type="dxa" w:w="2880"/>
+            <w:vAlign w:val="center"/>
+          </w:tcPr>
+          <w:p>
+            <w:pPr>
+              <w:spacing w:after="40" w:before="40"/>
+            </w:pPr>
+            <w:r>
+              <w:rPr>
+                <w:sz w:val="26"/>
+              </w:rPr>
+              <w:t>curriculum.ts / CourseBuilder</w:t>
+            </w:r>
+          </w:p>
+        </w:tc>
+        <w:tc>
+          <w:tcPr>
+            <w:tcW w:type="dxa" w:w="3600"/>
+            <w:vAlign w:val="center"/>
+          </w:tcPr>
+          <w:p>
+            <w:pPr>
+              <w:spacing w:after="40" w:before="40"/>
+            </w:pPr>
+            <w:r>
+              <w:rPr>
+                <w:sz w:val="26"/>
+              </w:rPr>
+              <w:t>โครงสร้างรายวิชาวิทยาการคำนวณ ว ๔.๒ ป.๑–ม.๓, คำอธิบายรายวิชา และแผนจัดเวลาเรียน ๒๕ คาบ/สัปดาห์</w:t>
+            </w:r>
+          </w:p>
+        </w:tc>
+        <w:tc>
+          <w:tcPr>
+            <w:tcW w:type="dxa" w:w="1440"/>
+            <w:vAlign w:val="center"/>
+          </w:tcPr>
+          <w:p>
+            <w:pPr>
+              <w:spacing w:after="40" w:before="40"/>
+            </w:pPr>
+            <w:r>
+              <w:rPr>
+                <w:sz w:val="26"/>
+              </w:rPr>
+              <w:t>ตัวชี้วัด ๑.๑</w:t>
+            </w:r>
+          </w:p>
+        </w:tc>
+      </w:tr>
+      <w:tr>
+        <w:tc>
+          <w:tcPr>
+            <w:tcW w:type="dxa" w:w="2160"/>
+            <w:vAlign w:val="center"/>
+            <w:shd w:fill="F8EEF0"/>
+          </w:tcPr>
+          <w:p>
+            <w:pPr>
+              <w:spacing w:after="40" w:before="40"/>
+            </w:pPr>
+            <w:r>
+              <w:rPr>
+                <w:sz w:val="26"/>
+              </w:rPr>
+              <w:t>๒. แผนการสอน (Lesson Plans)</w:t>
+            </w:r>
+          </w:p>
+        </w:tc>
+        <w:tc>
+          <w:tcPr>
+            <w:tcW w:type="dxa" w:w="2880"/>
+            <w:vAlign w:val="center"/>
+            <w:shd w:fill="F8EEF0"/>
+          </w:tcPr>
+          <w:p>
+            <w:pPr>
+              <w:spacing w:after="40" w:before="40"/>
+            </w:pPr>
+            <w:r>
+              <w:rPr>
+                <w:sz w:val="26"/>
+              </w:rPr>
+              <w:t>P1TechnologyPlan / CoursePlan5</w:t>
+            </w:r>
+          </w:p>
+        </w:tc>
+        <w:tc>
+          <w:tcPr>
+            <w:tcW w:type="dxa" w:w="3600"/>
+            <w:vAlign w:val="center"/>
+            <w:shd w:fill="F8EEF0"/>
+          </w:tcPr>
+          <w:p>
+            <w:pPr>
+              <w:spacing w:after="40" w:before="40"/>
+            </w:pPr>
+            <w:r>
+              <w:rPr>
+                <w:sz w:val="26"/>
+              </w:rPr>
+              <w:t>แผน Active Learning ๔ แผนประเด็นท้าทาย ป.๑ (แผน ๕–๘ รวม ๒๐๐ นาที) พร้อมสื่อสไลด์และใบงานดิจิทัล</w:t>
+            </w:r>
+          </w:p>
+        </w:tc>
+        <w:tc>
+          <w:tcPr>
+            <w:tcW w:type="dxa" w:w="1440"/>
+            <w:vAlign w:val="center"/>
+            <w:shd w:fill="F8EEF0"/>
+          </w:tcPr>
+          <w:p>
+            <w:pPr>
+              <w:spacing w:after="40" w:before="40"/>
+            </w:pPr>
+            <w:r>
+              <w:rPr>
+                <w:sz w:val="26"/>
+              </w:rPr>
+              <w:t>ตัวชี้วัด ๑.๒, ๑.๔</w:t>
+            </w:r>
+          </w:p>
+        </w:tc>
+      </w:tr>
+      <w:tr>
+        <w:tc>
+          <w:tcPr>
+            <w:tcW w:type="dxa" w:w="2160"/>
+            <w:vAlign w:val="center"/>
+          </w:tcPr>
+          <w:p>
+            <w:pPr>
+              <w:spacing w:after="40" w:before="40"/>
+            </w:pPr>
+            <w:r>
+              <w:rPr>
+                <w:sz w:val="26"/>
+              </w:rPr>
+              <w:t>๓. บันทึกหลังแผน (Post-Lesson)</w:t>
+            </w:r>
+          </w:p>
+        </w:tc>
+        <w:tc>
+          <w:tcPr>
+            <w:tcW w:type="dxa" w:w="2880"/>
+            <w:vAlign w:val="center"/>
+          </w:tcPr>
+          <w:p>
+            <w:pPr>
+              <w:spacing w:after="40" w:before="40"/>
+            </w:pPr>
+            <w:r>
+              <w:rPr>
+                <w:sz w:val="26"/>
+              </w:rPr>
+              <w:t>lessonRecordService / QuickAttendance</w:t>
+            </w:r>
+          </w:p>
+        </w:tc>
+        <w:tc>
+          <w:tcPr>
+            <w:tcW w:type="dxa" w:w="3600"/>
+            <w:vAlign w:val="center"/>
+          </w:tcPr>
+          <w:p>
+            <w:pPr>
+              <w:spacing w:after="40" w:before="40"/>
+            </w:pPr>
+            <w:r>
+              <w:rPr>
+                <w:sz w:val="26"/>
+              </w:rPr>
+              <w:t>บันทึกผลการสอน K-P-A รายชั่วโมง, เช็คชื่อ Real-time, บันทึกจุดเด่น ปัญหา และแนวทางแก้ไข</w:t>
+            </w:r>
+          </w:p>
+        </w:tc>
+        <w:tc>
+          <w:tcPr>
+            <w:tcW w:type="dxa" w:w="1440"/>
+            <w:vAlign w:val="center"/>
+          </w:tcPr>
+          <w:p>
+            <w:pPr>
+              <w:spacing w:after="40" w:before="40"/>
+            </w:pPr>
+            <w:r>
+              <w:rPr>
+                <w:sz w:val="26"/>
+              </w:rPr>
+              <w:t>ตัวชี้วัด ๑.๓, ๑.๗</w:t>
+            </w:r>
+          </w:p>
+        </w:tc>
+      </w:tr>
+      <w:tr>
+        <w:tc>
+          <w:tcPr>
+            <w:tcW w:type="dxa" w:w="2160"/>
+            <w:vAlign w:val="center"/>
+            <w:shd w:fill="F8EEF0"/>
+          </w:tcPr>
+          <w:p>
+            <w:pPr>
+              <w:spacing w:after="40" w:before="40"/>
+            </w:pPr>
+            <w:r>
+              <w:rPr>
+                <w:sz w:val="26"/>
+              </w:rPr>
+              <w:t>๔. ผลการเรียน &amp; ปพ.๕</w:t>
+            </w:r>
+          </w:p>
+        </w:tc>
+        <w:tc>
+          <w:tcPr>
+            <w:tcW w:type="dxa" w:w="2880"/>
+            <w:vAlign w:val="center"/>
+            <w:shd w:fill="F8EEF0"/>
+          </w:tcPr>
+          <w:p>
+            <w:pPr>
+              <w:spacing w:after="40" w:before="40"/>
+            </w:pPr>
+            <w:r>
+              <w:rPr>
+                <w:sz w:val="26"/>
+              </w:rPr>
+              <w:t>GradeBook / OfficialPp5PrintLayout</w:t>
+            </w:r>
+          </w:p>
+        </w:tc>
+        <w:tc>
+          <w:tcPr>
+            <w:tcW w:type="dxa" w:w="3600"/>
+            <w:vAlign w:val="center"/>
+            <w:shd w:fill="F8EEF0"/>
+          </w:tcPr>
+          <w:p>
+            <w:pPr>
+              <w:spacing w:after="40" w:before="40"/>
+            </w:pPr>
+            <w:r>
+              <w:rPr>
+                <w:sz w:val="26"/>
+              </w:rPr>
+              <w:t>ระบบสมุดคะแนน K-P-A, บัญชีคะแนนรูบริกส์ ๔ ด้าน ป.๑ (๑๑ คน) และออกเอกสารทางการ ปพ.๕ ดิจิทัล (PDF/Excel)</w:t>
+            </w:r>
+          </w:p>
+        </w:tc>
+        <w:tc>
+          <w:tcPr>
+            <w:tcW w:type="dxa" w:w="1440"/>
+            <w:vAlign w:val="center"/>
+            <w:shd w:fill="F8EEF0"/>
+          </w:tcPr>
+          <w:p>
+            <w:pPr>
+              <w:spacing w:after="40" w:before="40"/>
+            </w:pPr>
+            <w:r>
+              <w:rPr>
+                <w:sz w:val="26"/>
+              </w:rPr>
+              <w:t>ตัวชี้วัด ๑.๕, ๒.๑</w:t>
+            </w:r>
+          </w:p>
+        </w:tc>
+      </w:tr>
+    </w:tbl>
+    <w:p>
+      <w:pPr>
+        <w:spacing w:after="40"/>
+      </w:pPr>
     </w:p>
     <w:p>
       <w:r>

</xml_diff>

<commit_message>
feat(gallery): integrate 23 authentic classroom photos from media_pa into website gallery, filters, and Word report
</commit_message>
<xml_diff>
--- a/assets/docs/รายงานผลการพัฒนางาน PA 2569 นายอนันตชัย เพ็ชรรี่.docx
+++ b/assets/docs/รายงานผลการพัฒนางาน PA 2569 นายอนันตชัย เพ็ชรรี่.docx
@@ -8394,6 +8394,193 @@
       </w:r>
     </w:p>
     <w:p>
+      <w:pPr>
+        <w:spacing w:before="160" w:after="120"/>
+      </w:pPr>
+      <w:r>
+        <w:rPr>
+          <w:rFonts w:ascii="TH Sarabun New" w:hAnsi="TH Sarabun New" w:eastAsia="TH Sarabun New"/>
+          <w:b/>
+          <w:color w:val="8F1D2C"/>
+          <w:sz w:val="34"/>
+        </w:rPr>
+        <w:t>ภาพถ่ายหลักฐานเชิงประจักษ์การจัดกิจกรรมการเรียนรู้และการใช้สื่อ (ห้องปฏิบัติการคอมพิวเตอร์)</w:t>
+      </w:r>
+    </w:p>
+    <w:p>
+      <w:pPr>
+        <w:spacing w:before="0" w:after="80"/>
+      </w:pPr>
+      <w:r>
+        <w:rPr>
+          <w:rFonts w:ascii="TH Sarabun New" w:hAnsi="TH Sarabun New" w:eastAsia="TH Sarabun New"/>
+          <w:b w:val="0"/>
+          <w:color w:val="1E3A8A"/>
+          <w:sz w:val="28"/>
+        </w:rPr>
+        <w:t>ภาพบรรยากาศจริงในการจัดกิจกรรมการเรียนรู้ Active Learning และนวัตกรรม Gamification ในรอบปีการศึกษา ๒๕๖๙ ณ โรงเรียนบ้านคลองมดแดง :</w:t>
+      </w:r>
+    </w:p>
+    <w:p>
+      <w:pPr>
+        <w:jc w:val="center"/>
+      </w:pPr>
+      <w:r>
+        <w:drawing>
+          <wp:inline xmlns:a="http://schemas.openxmlformats.org/drawingml/2006/main" xmlns:pic="http://schemas.openxmlformats.org/drawingml/2006/picture">
+            <wp:extent cx="4754880" cy="3566160"/>
+            <wp:docPr id="2" name="Picture 2" descr="นักเรียนชั้น ป.๑ ฝึกปฏิบัติการใช้เมาส์และโค้ดดิ้งแบบเพื่อนช่วยเพื่อน (๑๐ ก.ย. ๒๕๖๙)"/>
+            <wp:cNvGraphicFramePr>
+              <a:graphicFrameLocks noChangeAspect="1"/>
+            </wp:cNvGraphicFramePr>
+            <a:graphic>
+              <a:graphicData uri="http://schemas.openxmlformats.org/drawingml/2006/picture">
+                <pic:pic>
+                  <pic:nvPicPr>
+                    <pic:cNvPr id="0" name="IMG_20260910_133441_1_.jpg"/>
+                    <pic:cNvPicPr/>
+                  </pic:nvPicPr>
+                  <pic:blipFill>
+                    <a:blip r:embed="rId10"/>
+                    <a:stretch>
+                      <a:fillRect/>
+                    </a:stretch>
+                  </pic:blipFill>
+                  <pic:spPr>
+                    <a:xfrm>
+                      <a:off x="0" y="0"/>
+                      <a:ext cx="4754880" cy="3566160"/>
+                    </a:xfrm>
+                    <a:prstGeom prst="rect"/>
+                  </pic:spPr>
+                </pic:pic>
+              </a:graphicData>
+            </a:graphic>
+          </wp:inline>
+        </w:drawing>
+      </w:r>
+    </w:p>
+    <w:p>
+      <w:pPr>
+        <w:spacing w:before="0" w:after="200"/>
+        <w:jc w:val="center"/>
+      </w:pPr>
+      <w:r>
+        <w:rPr>
+          <w:rFonts w:ascii="TH Sarabun New" w:hAnsi="TH Sarabun New" w:eastAsia="TH Sarabun New"/>
+          <w:b w:val="0"/>
+          <w:sz w:val="24"/>
+        </w:rPr>
+        <w:t>ภาพที่ ๑ : นักเรียนชั้น ป.๑ (๑๑ คน) ฝึกปฏิบัติการใช้เมาส์และบล็อกโค้ดดิ้งแก้ปัญหาเขาวงกต (Code.org) แบบ ๑ คนต่อ ๑ เครื่อง โดยมีเพื่อนนักเรียนร่วมสังเกตและเรียนรู้แบบเพื่อนช่วยเพื่อน (๑๐ ก.ย. ๒๕๖๙)</w:t>
+      </w:r>
+    </w:p>
+    <w:p>
+      <w:pPr>
+        <w:jc w:val="center"/>
+      </w:pPr>
+      <w:r>
+        <w:drawing>
+          <wp:inline xmlns:a="http://schemas.openxmlformats.org/drawingml/2006/main" xmlns:pic="http://schemas.openxmlformats.org/drawingml/2006/picture">
+            <wp:extent cx="4754880" cy="3566160"/>
+            <wp:docPr id="3" name="Picture 3" descr="ผลสัมฤทธิ์ประเด็นท้าทาย ป.๑ ผ่านเกณฑ์ปฏิบัติ ๑๐๐% (๑๐ ก.ย. ๒๕๖๙)"/>
+            <wp:cNvGraphicFramePr>
+              <a:graphicFrameLocks noChangeAspect="1"/>
+            </wp:cNvGraphicFramePr>
+            <a:graphic>
+              <a:graphicData uri="http://schemas.openxmlformats.org/drawingml/2006/picture">
+                <pic:pic>
+                  <pic:nvPicPr>
+                    <pic:cNvPr id="0" name="IMG_20260910_133655.jpg"/>
+                    <pic:cNvPicPr/>
+                  </pic:nvPicPr>
+                  <pic:blipFill>
+                    <a:blip r:embed="rId11"/>
+                    <a:stretch>
+                      <a:fillRect/>
+                    </a:stretch>
+                  </pic:blipFill>
+                  <pic:spPr>
+                    <a:xfrm>
+                      <a:off x="0" y="0"/>
+                      <a:ext cx="4754880" cy="3566160"/>
+                    </a:xfrm>
+                    <a:prstGeom prst="rect"/>
+                  </pic:spPr>
+                </pic:pic>
+              </a:graphicData>
+            </a:graphic>
+          </wp:inline>
+        </w:drawing>
+      </w:r>
+    </w:p>
+    <w:p>
+      <w:pPr>
+        <w:spacing w:before="0" w:after="200"/>
+        <w:jc w:val="center"/>
+      </w:pPr>
+      <w:r>
+        <w:rPr>
+          <w:rFonts w:ascii="TH Sarabun New" w:hAnsi="TH Sarabun New" w:eastAsia="TH Sarabun New"/>
+          <w:b w:val="0"/>
+          <w:sz w:val="24"/>
+        </w:rPr>
+        <w:t>ภาพที่ ๒ : ผลสัมฤทธิ์เชิงประจักษ์ประเด็นท้าทาย ผู้เรียน ป.๑ ควบคุมเมาส์ได้อย่างคล่องแคล่วและผ่านเกณฑ์ทักษะปฏิบัติครบทั้ง ๑๑ คน (๑๐๐%) (๑๐ ก.ย. ๒๕๖๙)</w:t>
+      </w:r>
+    </w:p>
+    <w:p>
+      <w:pPr>
+        <w:jc w:val="center"/>
+      </w:pPr>
+      <w:r>
+        <w:drawing>
+          <wp:inline xmlns:a="http://schemas.openxmlformats.org/drawingml/2006/main" xmlns:pic="http://schemas.openxmlformats.org/drawingml/2006/picture">
+            <wp:extent cx="4754880" cy="3566160"/>
+            <wp:docPr id="4" name="Picture 4" descr="การจัดการเรียนรู้ซอฟต์แวร์เบื้องต้นและสภาพแวดล้อมห้องคอมพิวเตอร์ (๒ ก.พ. ๒๕๖๙)"/>
+            <wp:cNvGraphicFramePr>
+              <a:graphicFrameLocks noChangeAspect="1"/>
+            </wp:cNvGraphicFramePr>
+            <a:graphic>
+              <a:graphicData uri="http://schemas.openxmlformats.org/drawingml/2006/picture">
+                <pic:pic>
+                  <pic:nvPicPr>
+                    <pic:cNvPr id="0" name="IMG_20260202_104526.jpg"/>
+                    <pic:cNvPicPr/>
+                  </pic:nvPicPr>
+                  <pic:blipFill>
+                    <a:blip r:embed="rId12"/>
+                    <a:stretch>
+                      <a:fillRect/>
+                    </a:stretch>
+                  </pic:blipFill>
+                  <pic:spPr>
+                    <a:xfrm>
+                      <a:off x="0" y="0"/>
+                      <a:ext cx="4754880" cy="3566160"/>
+                    </a:xfrm>
+                    <a:prstGeom prst="rect"/>
+                  </pic:spPr>
+                </pic:pic>
+              </a:graphicData>
+            </a:graphic>
+          </wp:inline>
+        </w:drawing>
+      </w:r>
+    </w:p>
+    <w:p>
+      <w:pPr>
+        <w:spacing w:before="0" w:after="200"/>
+        <w:jc w:val="center"/>
+      </w:pPr>
+      <w:r>
+        <w:rPr>
+          <w:rFonts w:ascii="TH Sarabun New" w:hAnsi="TH Sarabun New" w:eastAsia="TH Sarabun New"/>
+          <w:b w:val="0"/>
+          <w:sz w:val="24"/>
+        </w:rPr>
+        <w:t>ภาพที่ ๓ : การจัดการเรียนรู้หน่วยการใช้งานซอฟต์แวร์เบื้องต้น มีจอ Smart TV ขนาดใหญ่สาธิตบทเรียน และแผ่นรองโต๊ะผังแป้นพิมพ์และการจับเมาส์ถูกสุขลักษณะ (๒ ก.พ. ๒๕๖๙)</w:t>
+      </w:r>
+    </w:p>
+    <w:p>
       <w:r>
         <w:br w:type="page"/>
       </w:r>
@@ -10016,7 +10203,7 @@
       </w:r>
     </w:p>
     <w:sectPr>
-      <w:footerReference w:type="default" r:id="rId10"/>
+      <w:footerReference w:type="default" r:id="rId13"/>
       <w:pgSz w:w="12240" w:h="15840"/>
       <w:pgMar w:top="1037" w:right="1181" w:bottom="1037" w:left="1181" w:header="720" w:footer="720" w:gutter="0"/>
       <w:cols w:space="720"/>

</xml_diff>